<commit_message>
Repair linked teaching programs
</commit_message>
<xml_diff>
--- a/subject-program-library/programs/Food-Selection-and-Health-20-Period-Teaching-Program-v2.0-Network-Benchmark.docx
+++ b/subject-program-library/programs/Food-Selection-and-Health-20-Period-Teaching-Program-v2.0-Network-Benchmark.docx
@@ -449,7 +449,7 @@
               <w:spacing w:after="0"/>
             </w:pPr>
             <w:r/>
-            <w:hyperlink r:id="rId72">
+            <w:hyperlink r:id="rId112">
               <w:r>
                 <w:rPr>
                   <w:rFonts w:ascii="Aptos" w:hAnsi="Aptos"/>
@@ -1526,7 +1526,7 @@
             <w:pPr>
               <w:spacing w:before="20" w:after="0"/>
             </w:pPr>
-            <w:hyperlink r:id="rId75">
+            <w:hyperlink r:id="rId113">
               <w:r>
                 <w:rPr>
                   <w:rFonts w:ascii="Aptos" w:hAnsi="Aptos"/>
@@ -1547,7 +1547,7 @@
               </w:rPr>
               <w:t xml:space="preserve"> | </w:t>
             </w:r>
-            <w:hyperlink r:id="rId76">
+            <w:hyperlink r:id="rId114">
               <w:r>
                 <w:rPr>
                   <w:rFonts w:ascii="Aptos" w:hAnsi="Aptos"/>
@@ -1737,7 +1737,7 @@
             <w:pPr>
               <w:spacing w:before="20" w:after="0"/>
             </w:pPr>
-            <w:hyperlink r:id="rId77">
+            <w:hyperlink r:id="rId115">
               <w:r>
                 <w:rPr>
                   <w:rFonts w:ascii="Aptos" w:hAnsi="Aptos"/>
@@ -1758,7 +1758,7 @@
               </w:rPr>
               <w:t xml:space="preserve"> | </w:t>
             </w:r>
-            <w:hyperlink r:id="rId78">
+            <w:hyperlink r:id="rId116">
               <w:r>
                 <w:rPr>
                   <w:rFonts w:ascii="Aptos" w:hAnsi="Aptos"/>
@@ -1948,7 +1948,7 @@
             <w:pPr>
               <w:spacing w:before="20" w:after="0"/>
             </w:pPr>
-            <w:hyperlink r:id="rId79">
+            <w:hyperlink r:id="rId117">
               <w:r>
                 <w:rPr>
                   <w:rFonts w:ascii="Aptos" w:hAnsi="Aptos"/>
@@ -1969,7 +1969,7 @@
               </w:rPr>
               <w:t xml:space="preserve"> | </w:t>
             </w:r>
-            <w:hyperlink r:id="rId80">
+            <w:hyperlink r:id="rId118">
               <w:r>
                 <w:rPr>
                   <w:rFonts w:ascii="Aptos" w:hAnsi="Aptos"/>
@@ -2159,7 +2159,7 @@
             <w:pPr>
               <w:spacing w:before="20" w:after="0"/>
             </w:pPr>
-            <w:hyperlink r:id="rId81">
+            <w:hyperlink r:id="rId119">
               <w:r>
                 <w:rPr>
                   <w:rFonts w:ascii="Aptos" w:hAnsi="Aptos"/>
@@ -2180,7 +2180,7 @@
               </w:rPr>
               <w:t xml:space="preserve"> | </w:t>
             </w:r>
-            <w:hyperlink r:id="rId82">
+            <w:hyperlink r:id="rId120">
               <w:r>
                 <w:rPr>
                   <w:rFonts w:ascii="Aptos" w:hAnsi="Aptos"/>
@@ -2370,7 +2370,7 @@
             <w:pPr>
               <w:spacing w:before="20" w:after="0"/>
             </w:pPr>
-            <w:hyperlink r:id="rId83">
+            <w:hyperlink r:id="rId121">
               <w:r>
                 <w:rPr>
                   <w:rFonts w:ascii="Aptos" w:hAnsi="Aptos"/>
@@ -2391,7 +2391,7 @@
               </w:rPr>
               <w:t xml:space="preserve"> | </w:t>
             </w:r>
-            <w:hyperlink r:id="rId84">
+            <w:hyperlink r:id="rId122">
               <w:r>
                 <w:rPr>
                   <w:rFonts w:ascii="Aptos" w:hAnsi="Aptos"/>
@@ -2581,7 +2581,7 @@
             <w:pPr>
               <w:spacing w:before="20" w:after="0"/>
             </w:pPr>
-            <w:hyperlink r:id="rId85">
+            <w:hyperlink r:id="rId123">
               <w:r>
                 <w:rPr>
                   <w:rFonts w:ascii="Aptos" w:hAnsi="Aptos"/>
@@ -2602,7 +2602,7 @@
               </w:rPr>
               <w:t xml:space="preserve"> | </w:t>
             </w:r>
-            <w:hyperlink r:id="rId86">
+            <w:hyperlink r:id="rId124">
               <w:r>
                 <w:rPr>
                   <w:rFonts w:ascii="Aptos" w:hAnsi="Aptos"/>
@@ -2792,7 +2792,7 @@
             <w:pPr>
               <w:spacing w:before="20" w:after="0"/>
             </w:pPr>
-            <w:hyperlink r:id="rId87">
+            <w:hyperlink r:id="rId125">
               <w:r>
                 <w:rPr>
                   <w:rFonts w:ascii="Aptos" w:hAnsi="Aptos"/>
@@ -2813,7 +2813,7 @@
               </w:rPr>
               <w:t xml:space="preserve"> | </w:t>
             </w:r>
-            <w:hyperlink r:id="rId88">
+            <w:hyperlink r:id="rId126">
               <w:r>
                 <w:rPr>
                   <w:rFonts w:ascii="Aptos" w:hAnsi="Aptos"/>
@@ -3003,7 +3003,7 @@
             <w:pPr>
               <w:spacing w:before="20" w:after="0"/>
             </w:pPr>
-            <w:hyperlink r:id="rId89">
+            <w:hyperlink r:id="rId127">
               <w:r>
                 <w:rPr>
                   <w:rFonts w:ascii="Aptos" w:hAnsi="Aptos"/>
@@ -3024,7 +3024,7 @@
               </w:rPr>
               <w:t xml:space="preserve"> | </w:t>
             </w:r>
-            <w:hyperlink r:id="rId90">
+            <w:hyperlink r:id="rId128">
               <w:r>
                 <w:rPr>
                   <w:rFonts w:ascii="Aptos" w:hAnsi="Aptos"/>
@@ -3214,7 +3214,7 @@
             <w:pPr>
               <w:spacing w:before="20" w:after="0"/>
             </w:pPr>
-            <w:hyperlink r:id="rId91">
+            <w:hyperlink r:id="rId129">
               <w:r>
                 <w:rPr>
                   <w:rFonts w:ascii="Aptos" w:hAnsi="Aptos"/>
@@ -3235,7 +3235,7 @@
               </w:rPr>
               <w:t xml:space="preserve"> | </w:t>
             </w:r>
-            <w:hyperlink r:id="rId92">
+            <w:hyperlink r:id="rId130">
               <w:r>
                 <w:rPr>
                   <w:rFonts w:ascii="Aptos" w:hAnsi="Aptos"/>
@@ -3425,7 +3425,7 @@
             <w:pPr>
               <w:spacing w:before="20" w:after="0"/>
             </w:pPr>
-            <w:hyperlink r:id="rId93">
+            <w:hyperlink r:id="rId131">
               <w:r>
                 <w:rPr>
                   <w:rFonts w:ascii="Aptos" w:hAnsi="Aptos"/>
@@ -3446,7 +3446,7 @@
               </w:rPr>
               <w:t xml:space="preserve"> | </w:t>
             </w:r>
-            <w:hyperlink r:id="rId94">
+            <w:hyperlink r:id="rId132">
               <w:r>
                 <w:rPr>
                   <w:rFonts w:ascii="Aptos" w:hAnsi="Aptos"/>
@@ -3846,7 +3846,7 @@
             <w:pPr>
               <w:spacing w:before="20" w:after="0"/>
             </w:pPr>
-            <w:hyperlink r:id="rId95">
+            <w:hyperlink r:id="rId133">
               <w:r>
                 <w:rPr>
                   <w:rFonts w:ascii="Aptos" w:hAnsi="Aptos"/>
@@ -3867,7 +3867,7 @@
               </w:rPr>
               <w:t xml:space="preserve"> | </w:t>
             </w:r>
-            <w:hyperlink r:id="rId96">
+            <w:hyperlink r:id="rId134">
               <w:r>
                 <w:rPr>
                   <w:rFonts w:ascii="Aptos" w:hAnsi="Aptos"/>
@@ -4057,7 +4057,7 @@
             <w:pPr>
               <w:spacing w:before="20" w:after="0"/>
             </w:pPr>
-            <w:hyperlink r:id="rId97">
+            <w:hyperlink r:id="rId135">
               <w:r>
                 <w:rPr>
                   <w:rFonts w:ascii="Aptos" w:hAnsi="Aptos"/>
@@ -4078,7 +4078,7 @@
               </w:rPr>
               <w:t xml:space="preserve"> | </w:t>
             </w:r>
-            <w:hyperlink r:id="rId98">
+            <w:hyperlink r:id="rId136">
               <w:r>
                 <w:rPr>
                   <w:rFonts w:ascii="Aptos" w:hAnsi="Aptos"/>
@@ -4268,7 +4268,7 @@
             <w:pPr>
               <w:spacing w:before="20" w:after="0"/>
             </w:pPr>
-            <w:hyperlink r:id="rId99">
+            <w:hyperlink r:id="rId137">
               <w:r>
                 <w:rPr>
                   <w:rFonts w:ascii="Aptos" w:hAnsi="Aptos"/>
@@ -4289,7 +4289,7 @@
               </w:rPr>
               <w:t xml:space="preserve"> | </w:t>
             </w:r>
-            <w:hyperlink r:id="rId100">
+            <w:hyperlink r:id="rId138">
               <w:r>
                 <w:rPr>
                   <w:rFonts w:ascii="Aptos" w:hAnsi="Aptos"/>
@@ -4479,7 +4479,7 @@
             <w:pPr>
               <w:spacing w:before="20" w:after="0"/>
             </w:pPr>
-            <w:hyperlink r:id="rId101">
+            <w:hyperlink r:id="rId139">
               <w:r>
                 <w:rPr>
                   <w:rFonts w:ascii="Aptos" w:hAnsi="Aptos"/>
@@ -4500,7 +4500,7 @@
               </w:rPr>
               <w:t xml:space="preserve"> | </w:t>
             </w:r>
-            <w:hyperlink r:id="rId102">
+            <w:hyperlink r:id="rId140">
               <w:r>
                 <w:rPr>
                   <w:rFonts w:ascii="Aptos" w:hAnsi="Aptos"/>
@@ -4690,7 +4690,7 @@
             <w:pPr>
               <w:spacing w:before="20" w:after="0"/>
             </w:pPr>
-            <w:hyperlink r:id="rId103">
+            <w:hyperlink r:id="rId141">
               <w:r>
                 <w:rPr>
                   <w:rFonts w:ascii="Aptos" w:hAnsi="Aptos"/>
@@ -4711,7 +4711,7 @@
               </w:rPr>
               <w:t xml:space="preserve"> | </w:t>
             </w:r>
-            <w:hyperlink r:id="rId104">
+            <w:hyperlink r:id="rId142">
               <w:r>
                 <w:rPr>
                   <w:rFonts w:ascii="Aptos" w:hAnsi="Aptos"/>
@@ -4901,7 +4901,7 @@
             <w:pPr>
               <w:spacing w:before="20" w:after="0"/>
             </w:pPr>
-            <w:hyperlink r:id="rId105">
+            <w:hyperlink r:id="rId143">
               <w:r>
                 <w:rPr>
                   <w:rFonts w:ascii="Aptos" w:hAnsi="Aptos"/>
@@ -4922,7 +4922,7 @@
               </w:rPr>
               <w:t xml:space="preserve"> | </w:t>
             </w:r>
-            <w:hyperlink r:id="rId106">
+            <w:hyperlink r:id="rId144">
               <w:r>
                 <w:rPr>
                   <w:rFonts w:ascii="Aptos" w:hAnsi="Aptos"/>
@@ -5112,7 +5112,7 @@
             <w:pPr>
               <w:spacing w:before="20" w:after="0"/>
             </w:pPr>
-            <w:hyperlink r:id="rId107">
+            <w:hyperlink r:id="rId145">
               <w:r>
                 <w:rPr>
                   <w:rFonts w:ascii="Aptos" w:hAnsi="Aptos"/>
@@ -5133,7 +5133,7 @@
               </w:rPr>
               <w:t xml:space="preserve"> | </w:t>
             </w:r>
-            <w:hyperlink r:id="rId108">
+            <w:hyperlink r:id="rId146">
               <w:r>
                 <w:rPr>
                   <w:rFonts w:ascii="Aptos" w:hAnsi="Aptos"/>
@@ -5323,7 +5323,7 @@
             <w:pPr>
               <w:spacing w:before="20" w:after="0"/>
             </w:pPr>
-            <w:hyperlink r:id="rId109">
+            <w:hyperlink r:id="rId147">
               <w:r>
                 <w:rPr>
                   <w:rFonts w:ascii="Aptos" w:hAnsi="Aptos"/>
@@ -5344,7 +5344,7 @@
               </w:rPr>
               <w:t xml:space="preserve"> | </w:t>
             </w:r>
-            <w:hyperlink r:id="rId110">
+            <w:hyperlink r:id="rId148">
               <w:r>
                 <w:rPr>
                   <w:rFonts w:ascii="Aptos" w:hAnsi="Aptos"/>
@@ -5534,7 +5534,7 @@
             <w:pPr>
               <w:spacing w:before="20" w:after="0"/>
             </w:pPr>
-            <w:hyperlink r:id="rId103">
+            <w:hyperlink r:id="rId141">
               <w:r>
                 <w:rPr>
                   <w:rFonts w:ascii="Aptos" w:hAnsi="Aptos"/>
@@ -5555,7 +5555,7 @@
               </w:rPr>
               <w:t xml:space="preserve"> | </w:t>
             </w:r>
-            <w:hyperlink r:id="rId111">
+            <w:hyperlink r:id="rId149">
               <w:r>
                 <w:rPr>
                   <w:rFonts w:ascii="Aptos" w:hAnsi="Aptos"/>
@@ -5745,7 +5745,7 @@
             <w:pPr>
               <w:spacing w:before="20" w:after="0"/>
             </w:pPr>
-            <w:hyperlink r:id="rId109">
+            <w:hyperlink r:id="rId147">
               <w:r>
                 <w:rPr>
                   <w:rFonts w:ascii="Aptos" w:hAnsi="Aptos"/>
@@ -5766,7 +5766,7 @@
               </w:rPr>
               <w:t xml:space="preserve"> | </w:t>
             </w:r>
-            <w:hyperlink r:id="rId110">
+            <w:hyperlink r:id="rId148">
               <w:r>
                 <w:rPr>
                   <w:rFonts w:ascii="Aptos" w:hAnsi="Aptos"/>

</xml_diff>